<commit_message>
docs: add implementation reports for CR20 and CR26 change requests
</commit_message>
<xml_diff>
--- a/docs/08_change_management/CR020/04_Implementation_Report_CR-020_JFICT16.docx
+++ b/docs/08_change_management/CR020/04_Implementation_Report_CR-020_JFICT16.docx
@@ -1099,14 +1099,14 @@
               <w:rPr>
                 <w:sz w:val="19"/>
               </w:rPr>
-              <w:t xml:space="preserve">Imported and rendered &lt;ChangeStudentPassword /&gt; inside the student dashboard below the student profile </w:t>
+              <w:t xml:space="preserve">Imported and rendered &lt;ChangeStudentPassword /&gt; inside the </w:t>
             </w:r>
             <w:r>
               <w:rPr>
                 <w:sz w:val="19"/>
               </w:rPr>
               <w:lastRenderedPageBreak/>
-              <w:t>card.</w:t>
+              <w:t>student dashboard below the student profile card.</w:t>
             </w:r>
           </w:p>
         </w:tc>
@@ -4610,6 +4610,9 @@
         <w:keepNext/>
       </w:pPr>
       <w:r>
+        <w:rPr>
+          <w:noProof/>
+        </w:rPr>
         <w:drawing>
           <wp:inline distT="0" distB="0" distL="0" distR="0" wp14:anchorId="3BC3CF8E" wp14:editId="7E329024">
             <wp:extent cx="5733415" cy="3007360"/>
@@ -4722,6 +4725,9 @@
         <w:jc w:val="center"/>
       </w:pPr>
       <w:r>
+        <w:rPr>
+          <w:noProof/>
+        </w:rPr>
         <w:drawing>
           <wp:inline distT="0" distB="0" distL="0" distR="0" wp14:anchorId="502E459E" wp14:editId="3A1B41DE">
             <wp:extent cx="5733415" cy="2949575"/>

</xml_diff>